<commit_message>
Prepare pre-submission release candidate with diagnostic traceability files
</commit_message>
<xml_diff>
--- a/supplementary/R02A_retained_assignment_documentation_1_0.docx
+++ b/supplementary/R02A_retained_assignment_documentation_1_0.docx
@@ -366,11 +366,7 @@
         <w:shd w:fill="F2F2F2"/>
       </w:pPr>
       <w:r>
-        <w:rPr>
-          <w:rFonts w:ascii="Courier New" w:hAnsi="Courier New" w:eastAsia="Courier New"/>
-          <w:sz w:val="18"/>
-        </w:rPr>
-        <w:t>PILOT_R02A_sequence_cluster_hard_split_assignments.csv</w:t>
+        <w:t>splits/PILOT_R02A_sequence_cluster_hard_split_assignments.csv</w:t>
       </w:r>
     </w:p>
     <w:p>
@@ -392,11 +388,7 @@
         <w:shd w:fill="F2F2F2"/>
       </w:pPr>
       <w:r>
-        <w:rPr>
-          <w:rFonts w:ascii="Courier New" w:hAnsi="Courier New" w:eastAsia="Courier New"/>
-          <w:sz w:val="18"/>
-        </w:rPr>
-        <w:t>plm_execution/inputs/split_matching_1_0/plm_r02a_hard_split_source_assignments_1_0.csv</w:t>
+        <w:t>splits/r02a_hard_split_source_assignments_1_0.csv</w:t>
       </w:r>
     </w:p>
     <w:p>
@@ -418,11 +410,7 @@
         <w:shd w:fill="F2F2F2"/>
       </w:pPr>
       <w:r>
-        <w:rPr>
-          <w:rFonts w:ascii="Courier New" w:hAnsi="Courier New" w:eastAsia="Courier New"/>
-          <w:sz w:val="18"/>
-        </w:rPr>
-        <w:t>plm_execution/inputs/split_matching_1_0/plm_r02a_hard_split_train_test_manifest_1_0.csv</w:t>
+        <w:t>splits/r02a_hard_split_sensplus_manifest.csv</w:t>
       </w:r>
     </w:p>
     <w:tbl>
@@ -445,12 +433,7 @@
             <w:shd w:fill="D9EAF7"/>
           </w:tcPr>
           <w:p>
-            <w:r/>
             <w:r>
-              <w:rPr>
-                <w:b/>
-                <w:sz w:val="18"/>
-              </w:rPr>
               <w:t>File</w:t>
             </w:r>
           </w:p>
@@ -462,12 +445,7 @@
             <w:shd w:fill="D9EAF7"/>
           </w:tcPr>
           <w:p>
-            <w:r/>
             <w:r>
-              <w:rPr>
-                <w:b/>
-                <w:sz w:val="18"/>
-              </w:rPr>
               <w:t>Rows x columns</w:t>
             </w:r>
           </w:p>
@@ -479,12 +457,7 @@
             <w:shd w:fill="D9EAF7"/>
           </w:tcPr>
           <w:p>
-            <w:r/>
             <w:r>
-              <w:rPr>
-                <w:b/>
-                <w:sz w:val="18"/>
-              </w:rPr>
               <w:t>SHA256</w:t>
             </w:r>
           </w:p>
@@ -497,13 +470,8 @@
             <w:vAlign w:val="top"/>
           </w:tcPr>
           <w:p>
-            <w:r/>
             <w:r>
-              <w:rPr>
-                <w:b w:val="0"/>
-                <w:sz w:val="18"/>
-              </w:rPr>
-              <w:t>PILOT_R02A_sequence_cluster_hard_split_assignments.csv</w:t>
+              <w:t>splits/PILOT_R02A_sequence_cluster_hard_split_assignments.csv</w:t>
             </w:r>
           </w:p>
         </w:tc>
@@ -513,12 +481,7 @@
             <w:vAlign w:val="top"/>
           </w:tcPr>
           <w:p>
-            <w:r/>
             <w:r>
-              <w:rPr>
-                <w:b w:val="0"/>
-                <w:sz w:val="18"/>
-              </w:rPr>
               <w:t>177 x 27</w:t>
             </w:r>
           </w:p>
@@ -529,13 +492,8 @@
             <w:vAlign w:val="top"/>
           </w:tcPr>
           <w:p>
-            <w:r/>
             <w:r>
-              <w:rPr>
-                <w:b w:val="0"/>
-                <w:sz w:val="18"/>
-              </w:rPr>
-              <w:t>114d996a6ab5cfda90c44dc369691a1472f8b50c0dad2eab0a07da862fa25030</w:t>
+              <w:t>a74707d1ddbf8cc847d9587112ffffcc0052234abe4e2695a65b3621c21d4ef1</w:t>
             </w:r>
           </w:p>
         </w:tc>
@@ -547,13 +505,8 @@
             <w:vAlign w:val="top"/>
           </w:tcPr>
           <w:p>
-            <w:r/>
             <w:r>
-              <w:rPr>
-                <w:b w:val="0"/>
-                <w:sz w:val="18"/>
-              </w:rPr>
-              <w:t>plm_r02a_hard_split_source_assignments_1_0.csv</w:t>
+              <w:t>splits/r02a_hard_split_source_assignments_1_0.csv</w:t>
             </w:r>
           </w:p>
         </w:tc>
@@ -563,12 +516,7 @@
             <w:vAlign w:val="top"/>
           </w:tcPr>
           <w:p>
-            <w:r/>
             <w:r>
-              <w:rPr>
-                <w:b w:val="0"/>
-                <w:sz w:val="18"/>
-              </w:rPr>
               <w:t>177 x 17</w:t>
             </w:r>
           </w:p>
@@ -579,12 +527,7 @@
             <w:vAlign w:val="top"/>
           </w:tcPr>
           <w:p>
-            <w:r/>
             <w:r>
-              <w:rPr>
-                <w:b w:val="0"/>
-                <w:sz w:val="18"/>
-              </w:rPr>
               <w:t>d0ccb6e96e3e2462e60ddc78830e5001e8fff1da67c6506a28f99d61d81bda94</w:t>
             </w:r>
           </w:p>
@@ -597,13 +540,8 @@
             <w:vAlign w:val="top"/>
           </w:tcPr>
           <w:p>
-            <w:r/>
             <w:r>
-              <w:rPr>
-                <w:b w:val="0"/>
-                <w:sz w:val="18"/>
-              </w:rPr>
-              <w:t>plm_r02a_hard_split_train_test_manifest_1_0.csv</w:t>
+              <w:t>splits/r02a_hard_split_sensplus_manifest.csv</w:t>
             </w:r>
           </w:p>
         </w:tc>
@@ -613,12 +551,7 @@
             <w:vAlign w:val="top"/>
           </w:tcPr>
           <w:p>
-            <w:r/>
             <w:r>
-              <w:rPr>
-                <w:b w:val="0"/>
-                <w:sz w:val="18"/>
-              </w:rPr>
               <w:t>708 x 13</w:t>
             </w:r>
           </w:p>
@@ -629,18 +562,82 @@
             <w:vAlign w:val="top"/>
           </w:tcPr>
           <w:p>
-            <w:r/>
             <w:r>
-              <w:rPr>
-                <w:b w:val="0"/>
-                <w:sz w:val="18"/>
-              </w:rPr>
               <w:t>f033f06584aa3feec98395f93b3f8daf6182ff1c5b80e22c6d3620f9735f3bb0</w:t>
             </w:r>
           </w:p>
         </w:tc>
       </w:tr>
+      <w:tr>
+        <w:tc>
+          <w:tcPr>
+            <w:tcW w:type="dxa" w:w="3360"/>
+          </w:tcPr>
+          <w:p>
+            <w:r>
+              <w:t>splits/r02a_hard_split_core_only_manifest.csv</w:t>
+            </w:r>
+          </w:p>
+        </w:tc>
+        <w:tc>
+          <w:tcPr>
+            <w:tcW w:type="dxa" w:w="3360"/>
+          </w:tcPr>
+          <w:p>
+            <w:r>
+              <w:t>696 x 19</w:t>
+            </w:r>
+          </w:p>
+        </w:tc>
+        <w:tc>
+          <w:tcPr>
+            <w:tcW w:type="dxa" w:w="3360"/>
+          </w:tcPr>
+          <w:p>
+            <w:r>
+              <w:t>5091e959a3fa66319f19a65fc666b3d6dcfe63d407cb8c0f293f28ff2924f3d0</w:t>
+            </w:r>
+          </w:p>
+        </w:tc>
+      </w:tr>
+      <w:tr>
+        <w:tc>
+          <w:tcPr>
+            <w:tcW w:type="dxa" w:w="3360"/>
+          </w:tcPr>
+          <w:p>
+            <w:r>
+              <w:t>splits/r02a_hard_split_manifest.csv</w:t>
+            </w:r>
+          </w:p>
+        </w:tc>
+        <w:tc>
+          <w:tcPr>
+            <w:tcW w:type="dxa" w:w="3360"/>
+          </w:tcPr>
+          <w:p>
+            <w:r>
+              <w:t>1404 x 20</w:t>
+            </w:r>
+          </w:p>
+        </w:tc>
+        <w:tc>
+          <w:tcPr>
+            <w:tcW w:type="dxa" w:w="3360"/>
+          </w:tcPr>
+          <w:p>
+            <w:r>
+              <w:t>ac71d2156105a3dfb8bd477b9aecc3dd792a1d62d70d366eeaf0e23e0a0966b8</w:t>
+            </w:r>
+          </w:p>
+        </w:tc>
+      </w:tr>
     </w:tbl>
+    <w:p>
+      <w:r>
+        <w:t>Terminology note: R02A is the manuscript-facing stage name. Legacy P02A/p02a prefixes used in filenames or column names refer to the same retained-assignment sequence-cluster hard-split stress test.</w:t>
+      </w:r>
+    </w:p>
     <w:p>
       <w:pPr>
         <w:pStyle w:val="Heading1"/>
@@ -1710,6 +1707,11 @@
       </w:r>
     </w:p>
     <w:p>
+      <w:r>
+        <w:t>Legacy branch-label note: some retained R02A/split files use negative_core to denote the same branch that the public data dictionary names core_negative. This is a legacy naming synonym only; no relabeling or branch reassignment is implied.</w:t>
+      </w:r>
+    </w:p>
+    <w:p>
       <w:pPr>
         <w:pStyle w:val="Heading1"/>
       </w:pPr>
@@ -2339,330 +2341,23 @@
       <w:pPr>
         <w:pStyle w:val="Heading1"/>
       </w:pPr>
+      <w:r/>
       <w:r>
-        <w:t>11. Public-release checklist</w:t>
+        <w:t>11. Public-release status note</w:t>
       </w:r>
     </w:p>
-    <w:tbl>
-      <w:tblPr>
-        <w:tblStyle w:val="TableGrid"/>
-        <w:tblW w:type="auto" w:w="0"/>
-        <w:jc w:val="center"/>
-        <w:tblLook w:firstColumn="1" w:firstRow="1" w:lastColumn="0" w:lastRow="0" w:noHBand="0" w:noVBand="1" w:val="04A0"/>
-      </w:tblPr>
-      <w:tblGrid>
-        <w:gridCol w:w="5040"/>
-        <w:gridCol w:w="5040"/>
-      </w:tblGrid>
-      <w:tr>
-        <w:tc>
-          <w:tcPr>
-            <w:tcW w:type="dxa" w:w="5040"/>
-            <w:vAlign w:val="top"/>
-            <w:shd w:fill="D9EAF7"/>
-          </w:tcPr>
-          <w:p>
-            <w:r/>
-            <w:r>
-              <w:rPr>
-                <w:b/>
-                <w:sz w:val="18"/>
-              </w:rPr>
-              <w:t>Status</w:t>
-            </w:r>
-          </w:p>
-        </w:tc>
-        <w:tc>
-          <w:tcPr>
-            <w:tcW w:type="dxa" w:w="5040"/>
-            <w:vAlign w:val="top"/>
-            <w:shd w:fill="D9EAF7"/>
-          </w:tcPr>
-          <w:p>
-            <w:r/>
-            <w:r>
-              <w:rPr>
-                <w:b/>
-                <w:sz w:val="18"/>
-              </w:rPr>
-              <w:t>Item</w:t>
-            </w:r>
-          </w:p>
-        </w:tc>
-      </w:tr>
-      <w:tr>
-        <w:tc>
-          <w:tcPr>
-            <w:tcW w:type="dxa" w:w="5040"/>
-            <w:vAlign w:val="top"/>
-          </w:tcPr>
-          <w:p>
-            <w:r/>
-            <w:r>
-              <w:rPr>
-                <w:b w:val="0"/>
-                <w:sz w:val="18"/>
-              </w:rPr>
-              <w:t>[ ]</w:t>
-            </w:r>
-          </w:p>
-        </w:tc>
-        <w:tc>
-          <w:tcPr>
-            <w:tcW w:type="dxa" w:w="5040"/>
-            <w:vAlign w:val="top"/>
-          </w:tcPr>
-          <w:p>
-            <w:r/>
-            <w:r>
-              <w:rPr>
-                <w:b w:val="0"/>
-                <w:sz w:val="18"/>
-              </w:rPr>
-              <w:t>Confirm final public-safe file name for PILOT_R02A_sequence_cluster_hard_split_assignments.csv.</w:t>
-            </w:r>
-          </w:p>
-        </w:tc>
-      </w:tr>
-      <w:tr>
-        <w:tc>
-          <w:tcPr>
-            <w:tcW w:type="dxa" w:w="5040"/>
-            <w:vAlign w:val="top"/>
-          </w:tcPr>
-          <w:p>
-            <w:r/>
-            <w:r>
-              <w:rPr>
-                <w:b w:val="0"/>
-                <w:sz w:val="18"/>
-              </w:rPr>
-              <w:t>[ ]</w:t>
-            </w:r>
-          </w:p>
-        </w:tc>
-        <w:tc>
-          <w:tcPr>
-            <w:tcW w:type="dxa" w:w="5040"/>
-            <w:vAlign w:val="top"/>
-          </w:tcPr>
-          <w:p>
-            <w:r/>
-            <w:r>
-              <w:rPr>
-                <w:b w:val="0"/>
-                <w:sz w:val="18"/>
-              </w:rPr>
-              <w:t>Remove server-private absolute paths, hostnames, usernames, and draft-only comments from public release files.</w:t>
-            </w:r>
-          </w:p>
-        </w:tc>
-      </w:tr>
-      <w:tr>
-        <w:tc>
-          <w:tcPr>
-            <w:tcW w:type="dxa" w:w="5040"/>
-            <w:vAlign w:val="top"/>
-          </w:tcPr>
-          <w:p>
-            <w:r/>
-            <w:r>
-              <w:rPr>
-                <w:b w:val="0"/>
-                <w:sz w:val="18"/>
-              </w:rPr>
-              <w:t>[ ]</w:t>
-            </w:r>
-          </w:p>
-        </w:tc>
-        <w:tc>
-          <w:tcPr>
-            <w:tcW w:type="dxa" w:w="5040"/>
-            <w:vAlign w:val="top"/>
-          </w:tcPr>
-          <w:p>
-            <w:r/>
-            <w:r>
-              <w:rPr>
-                <w:b w:val="0"/>
-                <w:sz w:val="18"/>
-              </w:rPr>
-              <w:t>Add SHA256 checksums for retained assignment and downstream manifests.</w:t>
-            </w:r>
-          </w:p>
-        </w:tc>
-      </w:tr>
-      <w:tr>
-        <w:tc>
-          <w:tcPr>
-            <w:tcW w:type="dxa" w:w="5040"/>
-            <w:vAlign w:val="top"/>
-          </w:tcPr>
-          <w:p>
-            <w:r/>
-            <w:r>
-              <w:rPr>
-                <w:b w:val="0"/>
-                <w:sz w:val="18"/>
-              </w:rPr>
-              <w:t>[ ]</w:t>
-            </w:r>
-          </w:p>
-        </w:tc>
-        <w:tc>
-          <w:tcPr>
-            <w:tcW w:type="dxa" w:w="5040"/>
-            <w:vAlign w:val="top"/>
-          </w:tcPr>
-          <w:p>
-            <w:r/>
-            <w:r>
-              <w:rPr>
-                <w:b w:val="0"/>
-                <w:sz w:val="18"/>
-              </w:rPr>
-              <w:t>Place R02A retained-assignment documentation in Supplementary File S7 and GitHub documentation folder.</w:t>
-            </w:r>
-          </w:p>
-        </w:tc>
-      </w:tr>
-      <w:tr>
-        <w:tc>
-          <w:tcPr>
-            <w:tcW w:type="dxa" w:w="5040"/>
-            <w:vAlign w:val="top"/>
-          </w:tcPr>
-          <w:p>
-            <w:r/>
-            <w:r>
-              <w:rPr>
-                <w:b w:val="0"/>
-                <w:sz w:val="18"/>
-              </w:rPr>
-              <w:t>[ ]</w:t>
-            </w:r>
-          </w:p>
-        </w:tc>
-        <w:tc>
-          <w:tcPr>
-            <w:tcW w:type="dxa" w:w="5040"/>
-            <w:vAlign w:val="top"/>
-          </w:tcPr>
-          <w:p>
-            <w:r/>
-            <w:r>
-              <w:rPr>
-                <w:b w:val="0"/>
-                <w:sz w:val="18"/>
-              </w:rPr>
-              <w:t>Ensure Table 6 caption labels R02A rows as descriptive-only.</w:t>
-            </w:r>
-          </w:p>
-        </w:tc>
-      </w:tr>
-      <w:tr>
-        <w:tc>
-          <w:tcPr>
-            <w:tcW w:type="dxa" w:w="5040"/>
-            <w:vAlign w:val="top"/>
-          </w:tcPr>
-          <w:p>
-            <w:r/>
-            <w:r>
-              <w:rPr>
-                <w:b w:val="0"/>
-                <w:sz w:val="18"/>
-              </w:rPr>
-              <w:t>[ ]</w:t>
-            </w:r>
-          </w:p>
-        </w:tc>
-        <w:tc>
-          <w:tcPr>
-            <w:tcW w:type="dxa" w:w="5040"/>
-            <w:vAlign w:val="top"/>
-          </w:tcPr>
-          <w:p>
-            <w:r/>
-            <w:r>
-              <w:rPr>
-                <w:b w:val="0"/>
-                <w:sz w:val="18"/>
-              </w:rPr>
-              <w:t>Ensure Methods and Limitations do not claim CD-HIT, MMseqs2, or any external tool unless evidence is later recovered.</w:t>
-            </w:r>
-          </w:p>
-        </w:tc>
-      </w:tr>
-      <w:tr>
-        <w:tc>
-          <w:tcPr>
-            <w:tcW w:type="dxa" w:w="5040"/>
-            <w:vAlign w:val="top"/>
-          </w:tcPr>
-          <w:p>
-            <w:r/>
-            <w:r>
-              <w:rPr>
-                <w:b w:val="0"/>
-                <w:sz w:val="18"/>
-              </w:rPr>
-              <w:t>[ ]</w:t>
-            </w:r>
-          </w:p>
-        </w:tc>
-        <w:tc>
-          <w:tcPr>
-            <w:tcW w:type="dxa" w:w="5040"/>
-            <w:vAlign w:val="top"/>
-          </w:tcPr>
-          <w:p>
-            <w:r/>
-            <w:r>
-              <w:rPr>
-                <w:b w:val="0"/>
-                <w:sz w:val="18"/>
-              </w:rPr>
-              <w:t>Ensure challenge-only sequences are absent from all R02A train/test manifests.</w:t>
-            </w:r>
-          </w:p>
-        </w:tc>
-      </w:tr>
-      <w:tr>
-        <w:tc>
-          <w:tcPr>
-            <w:tcW w:type="dxa" w:w="5040"/>
-            <w:vAlign w:val="top"/>
-          </w:tcPr>
-          <w:p>
-            <w:r/>
-            <w:r>
-              <w:rPr>
-                <w:b w:val="0"/>
-                <w:sz w:val="18"/>
-              </w:rPr>
-              <w:t>[ ]</w:t>
-            </w:r>
-          </w:p>
-        </w:tc>
-        <w:tc>
-          <w:tcPr>
-            <w:tcW w:type="dxa" w:w="5040"/>
-            <w:vAlign w:val="top"/>
-          </w:tcPr>
-          <w:p>
-            <w:r/>
-            <w:r>
-              <w:rPr>
-                <w:b w:val="0"/>
-                <w:sz w:val="18"/>
-              </w:rPr>
-              <w:t>Ensure sensitivity negatives remain separate and are excluded from core-only rows.</w:t>
-            </w:r>
-          </w:p>
-        </w:tc>
-      </w:tr>
-    </w:tbl>
+    <w:p>
+      <w:pPr/>
+      <w:r>
+        <w:t>The R02A retained-assignment documentation has been reconciled for the v2.1.1 public-facing release candidate. The retained source filenames are current, SHA-256 records are provided in metadata/SHA256SUMS.txt, R02A is described as descriptive-only in manuscript-facing wording, no external clustering-tool claim is made without recovered evidence, challenge-only sequences remain absent from R02A train/test manifests, and sensitivity-negative rows remain separate from core-only rows.</w:t>
+      </w:r>
+    </w:p>
+    <w:p>
+      <w:pPr/>
+      <w:r>
+        <w:t>A final public-safety scan should still be repeated after any future author-side release changes, DOI updates, licensing changes, or repository restructuring.</w:t>
+      </w:r>
+    </w:p>
     <w:p>
       <w:pPr>
         <w:pStyle w:val="Heading1"/>

</xml_diff>